<commit_message>
Replace docx download with real Excel workbook; fix broken GitHub refs
Site's download button now serves Audit_Readiness_Dashboard_NIW_v2.xlsx
(mirrors the live dashboard's 6 pages with real formulas, filters, and
status/risk color-coding) instead of a .docx, matching what the
exhibit's instructions already described. Also corrected two dead
github.com/bilalgovernance/... references in the Exhibit 12.3 User
Summary to point to the real public repo.

Co-Authored-By: Claude Sonnet 5 <noreply@anthropic.com>
</commit_message>
<xml_diff>
--- a/Exhibit 12.3 Audit Readiness Dashboard User Summary.docx
+++ b/Exhibit 12.3 Audit Readiness Dashboard User Summary.docx
@@ -398,7 +398,7 @@
                 <w:sz w:val="21"/>
                 <w:szCs w:val="21"/>
               </w:rPr>
-              <w:t>Download the Excel workbook from GitHub (github.com/bilalgovernance/audit-readiness-framework). Open in Microsoft Excel or Google Sheets — no installation required. Enter your organization's compliance status, risk ratings, and evidence references into the Compliance Register tab. All seven dashboards update automatically.</w:t>
+              <w:t>Download the Excel workbook from www.quantioglobal.net, or view the source at github.com/FounderQuantio/Audit-Readiness-Dashboard. Open in Microsoft Excel or Google Sheets — no installation required. Enter your organization's compliance status, risk ratings, and evidence references into the Compliance Register tab. All seven dashboards update automatically.</w:t>
             </w:r>
           </w:p>
         </w:tc>
@@ -1464,7 +1464,7 @@
           <w:sz w:val="21"/>
           <w:szCs w:val="21"/>
         </w:rPr>
-        <w:t>Go to github.com/bilalgovernance/audit-readiness-framework and download the Excel file (Audit_Readiness_Dashboard_NIW_v2.xlsx). Save it to your organization's shared drive or compliance folder. Open it in Microsoft Excel — all formulas, filters, and colour-coding work natively. Google Sheets users: upload via File → Import. No macros or add-ins are required.</w:t>
+        <w:t>Go to www.quantioglobal.net (source: github.com/FounderQuantio/Audit-Readiness-Dashboard) and download the Excel file (Audit_Readiness_Dashboard_NIW_v2.xlsx). Save it to your organization's shared drive or compliance folder. Open it in Microsoft Excel — all formulas, filters, and colour-coding work natively. Google Sheets users: upload via File → Import. No macros or add-ins are required.</w:t>
       </w:r>
     </w:p>
     <w:p>

</xml_diff>